<commit_message>
Die Installationsanleitung wurde fehlerfrei getestet
Datensatzdatei für Digits generiert
</commit_message>
<xml_diff>
--- a/FOS12/Orange/Word-Dokumente/01_Orange_Installationsanleitung.docx
+++ b/FOS12/Orange/Word-Dokumente/01_Orange_Installationsanleitung.docx
@@ -31,27 +31,21 @@
       </w:r>
       <w:r>
         <w:rPr/>
-        <w:t xml:space="preserve"> Orange Data Mining | </w:t>
+        <w:t xml:space="preserve"> Orange Data Mining  | </w:t>
       </w:r>
       <w:r>
         <w:rPr>
           <w:b/>
         </w:rPr>
-        <w:t>Betriebssystem:</w:t>
-      </w:r>
-      <w:r>
-        <w:rPr/>
-        <w:t xml:space="preserve"> Windows 10/11 | </w:t>
-      </w:r>
-      <w:r>
-        <w:rPr>
-          <w:b/>
-        </w:rPr>
         <w:t>Stand:</w:t>
       </w:r>
       <w:r>
         <w:rPr/>
-        <w:t xml:space="preserve"> 2025</w:t>
+        <w:t xml:space="preserve"> 202</w:t>
+      </w:r>
+      <w:r>
+        <w:rPr/>
+        <w:t>6</w:t>
       </w:r>
     </w:p>
     <w:p>
@@ -212,6 +206,10 @@
               <w:rPr/>
               <w:t>Betriebssystem</w:t>
             </w:r>
+            <w:r>
+              <w:rPr/>
+              <w:t>e</w:t>
+            </w:r>
           </w:p>
         </w:tc>
         <w:tc>
@@ -232,7 +230,11 @@
             </w:pPr>
             <w:r>
               <w:rPr/>
-              <w:t>Windows 10 (64-Bit) oder Windows 11</w:t>
+              <w:t xml:space="preserve">Windows, </w:t>
+            </w:r>
+            <w:r>
+              <w:rPr/>
+              <w:t>macOS, ...</w:t>
             </w:r>
           </w:p>
         </w:tc>
@@ -1184,7 +1186,19 @@
         <w:rPr>
           <w:b/>
         </w:rPr>
-        <w:t>„Neural Network"</w:t>
+        <w:t>„</w:t>
+      </w:r>
+      <w:r>
+        <w:rPr>
+          <w:b/>
+        </w:rPr>
+        <w:t>Explain</w:t>
+      </w:r>
+      <w:r>
+        <w:rPr>
+          <w:b/>
+        </w:rPr>
+        <w:t>"</w:t>
       </w:r>
       <w:r>
         <w:rPr/>
@@ -1329,7 +1343,7 @@
         <w:rPr>
           <w:b/>
         </w:rPr>
-        <w:t>Orange3-Educational</w:t>
+        <w:t>Educational</w:t>
       </w:r>
       <w:r>
         <w:rPr/>
@@ -1360,7 +1374,7 @@
         <w:rPr>
           <w:b/>
         </w:rPr>
-        <w:t>Orange3-Explain</w:t>
+        <w:t>Explain</w:t>
       </w:r>
       <w:r>
         <w:rPr/>
@@ -1960,79 +1974,6 @@
           </w:p>
         </w:tc>
       </w:tr>
-      <w:tr>
-        <w:trPr/>
-        <w:tc>
-          <w:tcPr>
-            <w:tcW w:w="3212" w:type="dxa"/>
-            <w:tcBorders>
-              <w:start w:val="single" w:sz="4" w:space="0" w:color="000000"/>
-              <w:bottom w:val="single" w:sz="4" w:space="0" w:color="000000"/>
-            </w:tcBorders>
-          </w:tcPr>
-          <w:p>
-            <w:pPr>
-              <w:pStyle w:val="Tabelleninhalt"/>
-              <w:bidi w:val="0"/>
-              <w:jc w:val="start"/>
-              <w:rPr/>
-            </w:pPr>
-            <w:r>
-              <w:rPr>
-                <w:rFonts w:ascii="Liberation Mono" w:hAnsi="Liberation Mono"/>
-              </w:rPr>
-              <w:t>digits</w:t>
-            </w:r>
-            <w:r>
-              <w:rPr/>
-              <w:t xml:space="preserve"> (via Datasets-Widget)</w:t>
-            </w:r>
-          </w:p>
-        </w:tc>
-        <w:tc>
-          <w:tcPr>
-            <w:tcW w:w="3213" w:type="dxa"/>
-            <w:tcBorders>
-              <w:start w:val="single" w:sz="4" w:space="0" w:color="000000"/>
-              <w:bottom w:val="single" w:sz="4" w:space="0" w:color="000000"/>
-            </w:tcBorders>
-          </w:tcPr>
-          <w:p>
-            <w:pPr>
-              <w:pStyle w:val="Tabelleninhalt"/>
-              <w:bidi w:val="0"/>
-              <w:jc w:val="start"/>
-              <w:rPr/>
-            </w:pPr>
-            <w:r>
-              <w:rPr/>
-              <w:t>Klassifikation</w:t>
-            </w:r>
-          </w:p>
-        </w:tc>
-        <w:tc>
-          <w:tcPr>
-            <w:tcW w:w="3213" w:type="dxa"/>
-            <w:tcBorders>
-              <w:start w:val="single" w:sz="4" w:space="0" w:color="000000"/>
-              <w:bottom w:val="single" w:sz="4" w:space="0" w:color="000000"/>
-              <w:end w:val="single" w:sz="4" w:space="0" w:color="000000"/>
-            </w:tcBorders>
-          </w:tcPr>
-          <w:p>
-            <w:pPr>
-              <w:pStyle w:val="Tabelleninhalt"/>
-              <w:bidi w:val="0"/>
-              <w:jc w:val="start"/>
-              <w:rPr/>
-            </w:pPr>
-            <w:r>
-              <w:rPr/>
-              <w:t>Bilderkennung (8×8 Pixel)</w:t>
-            </w:r>
-          </w:p>
-        </w:tc>
-      </w:tr>
     </w:tbl>
     <w:p>
       <w:pPr>
@@ -2525,7 +2466,67 @@
       </w:pPr>
       <w:r>
         <w:rPr/>
-        <w:t>9. Weiterführende Ressourcen</w:t>
+        <w:t xml:space="preserve">8b. Datensatz </w:t>
+      </w:r>
+      <w:r>
+        <w:rPr>
+          <w:rFonts w:ascii="Liberation Mono" w:hAnsi="Liberation Mono"/>
+        </w:rPr>
+        <w:t>digits_8x8.tab</w:t>
+      </w:r>
+      <w:r>
+        <w:rPr/>
+        <w:t xml:space="preserve"> vorbereiten (für Unterrichtseinheit 2)</w:t>
+      </w:r>
+    </w:p>
+    <w:p>
+      <w:pPr>
+        <w:pStyle w:val="BodyText"/>
+        <w:bidi w:val="0"/>
+        <w:jc w:val="start"/>
+        <w:rPr/>
+      </w:pPr>
+      <w:r>
+        <w:rPr/>
+        <w:t>Für das Arbeitsblatt zur Vertiefung (Unterrichtseinheit 2, Abschnitte C und D) wird ein Datensatz mit handgeschriebenen Ziffern benötigt. Dieser liegt nicht direkt in Orange vor und muss einmalig erzeugt und bereitgestellt werden.</w:t>
+      </w:r>
+    </w:p>
+    <w:p>
+      <w:pPr>
+        <w:pStyle w:val="Heading3"/>
+        <w:bidi w:val="0"/>
+        <w:ind w:hanging="0" w:start="0"/>
+        <w:jc w:val="start"/>
+        <w:rPr/>
+      </w:pPr>
+      <w:r>
+        <w:rPr/>
+        <w:t>Voraussetzung</w:t>
+      </w:r>
+    </w:p>
+    <w:p>
+      <w:pPr>
+        <w:pStyle w:val="BodyText"/>
+        <w:bidi w:val="0"/>
+        <w:jc w:val="start"/>
+        <w:rPr/>
+      </w:pPr>
+      <w:r>
+        <w:rPr/>
+        <w:t>Python mit scikit-learn muss auf dem Rechner verfügbar sein. Bei einer bestehenden Orange-Installation ist Python bereits vorhanden. scikit-learn ist ebenfalls Teil der Orange-Umgebung.</w:t>
+      </w:r>
+    </w:p>
+    <w:p>
+      <w:pPr>
+        <w:pStyle w:val="Heading3"/>
+        <w:bidi w:val="0"/>
+        <w:ind w:hanging="0" w:start="0"/>
+        <w:jc w:val="start"/>
+        <w:rPr/>
+      </w:pPr>
+      <w:r>
+        <w:rPr/>
+        <w:t>Skript ausführen</w:t>
       </w:r>
     </w:p>
     <w:p>
@@ -2534,6 +2535,381 @@
         <w:numPr>
           <w:ilvl w:val="0"/>
           <w:numId w:val="9"/>
+        </w:numPr>
+        <w:tabs>
+          <w:tab w:val="clear" w:pos="709"/>
+          <w:tab w:val="left" w:pos="709" w:leader="none"/>
+        </w:tabs>
+        <w:bidi w:val="0"/>
+        <w:ind w:hanging="283" w:start="709"/>
+        <w:jc w:val="start"/>
+        <w:rPr/>
+      </w:pPr>
+      <w:r>
+        <w:rPr/>
+        <w:t xml:space="preserve">Öffnen Sie die </w:t>
+      </w:r>
+      <w:r>
+        <w:rPr>
+          <w:b/>
+        </w:rPr>
+        <w:t>Eingabeaufforderung</w:t>
+      </w:r>
+      <w:r>
+        <w:rPr/>
+        <w:t xml:space="preserve"> (cmd) oder </w:t>
+      </w:r>
+      <w:r>
+        <w:rPr>
+          <w:b/>
+        </w:rPr>
+        <w:t>PowerShell</w:t>
+      </w:r>
+      <w:r>
+        <w:rPr/>
+        <w:t xml:space="preserve"> und navigieren Sie in einen geeigneten Ordner, z. B.:</w:t>
+      </w:r>
+    </w:p>
+    <w:p>
+      <w:pPr>
+        <w:pStyle w:val="VorformatierterText"/>
+        <w:numPr>
+          <w:ilvl w:val="0"/>
+          <w:numId w:val="0"/>
+        </w:numPr>
+        <w:shd w:fill="E1E1E1" w:val="clear"/>
+        <w:bidi w:val="0"/>
+        <w:spacing w:before="0" w:after="283"/>
+        <w:ind w:hanging="0" w:start="0"/>
+        <w:jc w:val="start"/>
+        <w:rPr/>
+      </w:pPr>
+      <w:r>
+        <w:rPr/>
+        <w:t>cd C:\Users\&lt;IhrName&gt;\Desktop</w:t>
+      </w:r>
+    </w:p>
+    <w:p>
+      <w:pPr>
+        <w:pStyle w:val="BodyText"/>
+        <w:numPr>
+          <w:ilvl w:val="0"/>
+          <w:numId w:val="9"/>
+        </w:numPr>
+        <w:tabs>
+          <w:tab w:val="clear" w:pos="709"/>
+          <w:tab w:val="left" w:pos="709" w:leader="none"/>
+        </w:tabs>
+        <w:bidi w:val="0"/>
+        <w:ind w:hanging="283" w:start="709"/>
+        <w:jc w:val="start"/>
+        <w:rPr/>
+      </w:pPr>
+      <w:r>
+        <w:rPr/>
+        <w:t xml:space="preserve">Speichern Sie folgendes Skript als </w:t>
+      </w:r>
+      <w:r>
+        <w:rPr>
+          <w:rFonts w:ascii="Liberation Mono" w:hAnsi="Liberation Mono"/>
+        </w:rPr>
+        <w:t>make_digits.py</w:t>
+      </w:r>
+      <w:r>
+        <w:rPr/>
+        <w:t xml:space="preserve"> und führen Sie es aus:</w:t>
+      </w:r>
+    </w:p>
+    <w:p>
+      <w:pPr>
+        <w:pStyle w:val="VorformatierterText"/>
+        <w:numPr>
+          <w:ilvl w:val="0"/>
+          <w:numId w:val="0"/>
+        </w:numPr>
+        <w:shd w:fill="E1E1E1" w:val="clear"/>
+        <w:bidi w:val="0"/>
+        <w:spacing w:before="0" w:after="283"/>
+        <w:ind w:hanging="0" w:start="0"/>
+        <w:jc w:val="start"/>
+        <w:rPr/>
+      </w:pPr>
+      <w:r>
+        <w:rPr/>
+        <w:t>"%LOCALAPPDATA%\Orange3\python.exe" make_digits.py</w:t>
+      </w:r>
+    </w:p>
+    <w:p>
+      <w:pPr>
+        <w:pStyle w:val="BodyText"/>
+        <w:numPr>
+          <w:ilvl w:val="0"/>
+          <w:numId w:val="0"/>
+        </w:numPr>
+        <w:bidi w:val="0"/>
+        <w:ind w:hanging="0" w:start="0"/>
+        <w:jc w:val="start"/>
+        <w:rPr/>
+      </w:pPr>
+      <w:r>
+        <w:rPr/>
+        <w:t xml:space="preserve">Inhalt von </w:t>
+      </w:r>
+      <w:r>
+        <w:rPr>
+          <w:rFonts w:ascii="Liberation Mono" w:hAnsi="Liberation Mono"/>
+        </w:rPr>
+        <w:t>make_digits.py</w:t>
+      </w:r>
+      <w:r>
+        <w:rPr/>
+        <w:t>:</w:t>
+      </w:r>
+    </w:p>
+    <w:p>
+      <w:pPr>
+        <w:pStyle w:val="VorformatierterText"/>
+        <w:numPr>
+          <w:ilvl w:val="0"/>
+          <w:numId w:val="0"/>
+        </w:numPr>
+        <w:shd w:fill="E1E1E1" w:val="clear"/>
+        <w:bidi w:val="0"/>
+        <w:spacing w:before="0" w:after="283"/>
+        <w:ind w:hanging="0" w:start="0"/>
+        <w:jc w:val="start"/>
+        <w:rPr/>
+      </w:pPr>
+      <w:r>
+        <w:rPr/>
+        <w:t>from sklearn.datasets import load_digits</w:t>
+        <w:br/>
+        <w:t>import pandas as pd</w:t>
+        <w:br/>
+        <w:br/>
+        <w:t>digits = load_digits()</w:t>
+        <w:br/>
+        <w:br/>
+        <w:t>col_names = [f"pixel_{i}" for i in range(64)] + ["digit"]</w:t>
+        <w:br/>
+        <w:t>types     = ["continuous"] * 64 + ["discrete"]</w:t>
+        <w:br/>
+        <w:t>roles     = ["feature"]    * 64 + ["class"]</w:t>
+        <w:br/>
+        <w:br/>
+        <w:t>df = pd.DataFrame(digits.data, columns=col_names[:64])</w:t>
+        <w:br/>
+        <w:t>df["digit"] = digits.target.astype(str)</w:t>
+        <w:br/>
+        <w:br/>
+        <w:t># Orange .tab-Format: drei Kopfzeilen (Name / Typ / Rolle)</w:t>
+        <w:br/>
+        <w:t>with open("digits_8x8.tab", "w", encoding="utf-8") as f:</w:t>
+        <w:br/>
+        <w:t xml:space="preserve">    f.write("\t".join(col_names) + "\n")</w:t>
+        <w:br/>
+        <w:t xml:space="preserve">    f.write("\t".join(types)     + "\n")</w:t>
+        <w:br/>
+        <w:t xml:space="preserve">    f.write("\t".join(roles)     + "\n")</w:t>
+        <w:br/>
+        <w:t xml:space="preserve">    df.to_csv(f, sep="\t", index=False, header=False)</w:t>
+        <w:br/>
+        <w:br/>
+        <w:t>print(f"Fertig: {len(df)} Instanzen, Ziel: digit")</w:t>
+      </w:r>
+    </w:p>
+    <w:p>
+      <w:pPr>
+        <w:pStyle w:val="BodyText"/>
+        <w:numPr>
+          <w:ilvl w:val="0"/>
+          <w:numId w:val="9"/>
+        </w:numPr>
+        <w:tabs>
+          <w:tab w:val="clear" w:pos="709"/>
+          <w:tab w:val="left" w:pos="709" w:leader="none"/>
+        </w:tabs>
+        <w:bidi w:val="0"/>
+        <w:ind w:hanging="283" w:start="709"/>
+        <w:jc w:val="start"/>
+        <w:rPr/>
+      </w:pPr>
+      <w:r>
+        <w:rPr/>
+        <w:t xml:space="preserve">Die Datei </w:t>
+      </w:r>
+      <w:r>
+        <w:rPr>
+          <w:rFonts w:ascii="Liberation Mono" w:hAnsi="Liberation Mono"/>
+        </w:rPr>
+        <w:t>digits_8x8.tab</w:t>
+      </w:r>
+      <w:r>
+        <w:rPr/>
+        <w:t xml:space="preserve"> befindet sich nun im aktuellen Ordner.</w:t>
+      </w:r>
+    </w:p>
+    <w:p>
+      <w:pPr>
+        <w:pStyle w:val="Heading3"/>
+        <w:numPr>
+          <w:ilvl w:val="0"/>
+          <w:numId w:val="0"/>
+        </w:numPr>
+        <w:bidi w:val="0"/>
+        <w:ind w:hanging="0" w:start="0"/>
+        <w:jc w:val="start"/>
+        <w:rPr/>
+      </w:pPr>
+      <w:r>
+        <w:rPr/>
+        <w:t>Datei bereitstellen</w:t>
+      </w:r>
+    </w:p>
+    <w:p>
+      <w:pPr>
+        <w:pStyle w:val="BodyText"/>
+        <w:bidi w:val="0"/>
+        <w:jc w:val="start"/>
+        <w:rPr/>
+      </w:pPr>
+      <w:r>
+        <w:rPr/>
+        <w:t xml:space="preserve">Verteilen Sie </w:t>
+      </w:r>
+      <w:r>
+        <w:rPr>
+          <w:rFonts w:ascii="Liberation Mono" w:hAnsi="Liberation Mono"/>
+        </w:rPr>
+        <w:t>digits_8x8.tab</w:t>
+      </w:r>
+      <w:r>
+        <w:rPr/>
+        <w:t xml:space="preserve"> an die SuS, z. B. über:</w:t>
+      </w:r>
+    </w:p>
+    <w:p>
+      <w:pPr>
+        <w:pStyle w:val="BodyText"/>
+        <w:numPr>
+          <w:ilvl w:val="0"/>
+          <w:numId w:val="10"/>
+        </w:numPr>
+        <w:tabs>
+          <w:tab w:val="clear" w:pos="709"/>
+          <w:tab w:val="left" w:pos="709" w:leader="none"/>
+        </w:tabs>
+        <w:bidi w:val="0"/>
+        <w:ind w:hanging="283" w:start="709"/>
+        <w:jc w:val="start"/>
+        <w:rPr/>
+      </w:pPr>
+      <w:r>
+        <w:rPr/>
+        <w:t>Freigegebenen Netzwerkordner</w:t>
+      </w:r>
+    </w:p>
+    <w:p>
+      <w:pPr>
+        <w:pStyle w:val="BodyText"/>
+        <w:numPr>
+          <w:ilvl w:val="0"/>
+          <w:numId w:val="10"/>
+        </w:numPr>
+        <w:tabs>
+          <w:tab w:val="clear" w:pos="709"/>
+          <w:tab w:val="left" w:pos="709" w:leader="none"/>
+        </w:tabs>
+        <w:bidi w:val="0"/>
+        <w:ind w:hanging="283" w:start="709"/>
+        <w:jc w:val="start"/>
+        <w:rPr/>
+      </w:pPr>
+      <w:r>
+        <w:rPr/>
+        <w:t>Moodle-Kurs (als Dateidownload)</w:t>
+      </w:r>
+    </w:p>
+    <w:p>
+      <w:pPr>
+        <w:pStyle w:val="BodyText"/>
+        <w:numPr>
+          <w:ilvl w:val="0"/>
+          <w:numId w:val="10"/>
+        </w:numPr>
+        <w:tabs>
+          <w:tab w:val="clear" w:pos="709"/>
+          <w:tab w:val="left" w:pos="709" w:leader="none"/>
+        </w:tabs>
+        <w:bidi w:val="0"/>
+        <w:ind w:hanging="283" w:start="709"/>
+        <w:jc w:val="start"/>
+        <w:rPr/>
+      </w:pPr>
+      <w:r>
+        <w:rPr/>
+        <w:t>USB-Stick</w:t>
+      </w:r>
+    </w:p>
+    <w:p>
+      <w:pPr>
+        <w:pStyle w:val="BodyText"/>
+        <w:bidi w:val="0"/>
+        <w:jc w:val="start"/>
+        <w:rPr/>
+      </w:pPr>
+      <w:r>
+        <w:rPr/>
+        <w:t xml:space="preserve">Die SuS laden die Datei in Orange über das </w:t>
+      </w:r>
+      <w:r>
+        <w:rPr>
+          <w:b/>
+        </w:rPr>
+        <w:t>File-Widget</w:t>
+      </w:r>
+      <w:r>
+        <w:rPr/>
+        <w:t xml:space="preserve"> → Ordner-Symbol → Datei auswählen. Orange erkennt das </w:t>
+      </w:r>
+      <w:r>
+        <w:rPr>
+          <w:rFonts w:ascii="Liberation Mono" w:hAnsi="Liberation Mono"/>
+        </w:rPr>
+        <w:t>.tab</w:t>
+      </w:r>
+      <w:r>
+        <w:rPr/>
+        <w:t xml:space="preserve">-Format direkt; die Zielspalte </w:t>
+      </w:r>
+      <w:r>
+        <w:rPr>
+          <w:rFonts w:ascii="Liberation Mono" w:hAnsi="Liberation Mono"/>
+        </w:rPr>
+        <w:t>digit</w:t>
+      </w:r>
+      <w:r>
+        <w:rPr/>
+        <w:t xml:space="preserve"> wird automatisch als kategorische Variable erkannt.</w:t>
+      </w:r>
+    </w:p>
+    <w:p>
+      <w:pPr>
+        <w:pStyle w:val="HorizontaleLinie"/>
+        <w:bidi w:val="0"/>
+        <w:jc w:val="start"/>
+        <w:rPr/>
+      </w:pPr>
+      <w:r>
+        <w:rPr/>
+      </w:r>
+    </w:p>
+    <w:p>
+      <w:pPr>
+        <w:pStyle w:val="BodyText"/>
+        <w:numPr>
+          <w:ilvl w:val="0"/>
+          <w:numId w:val="11"/>
         </w:numPr>
         <w:tabs>
           <w:tab w:val="clear" w:pos="709"/>
@@ -2568,7 +2944,7 @@
         <w:pStyle w:val="BodyText"/>
         <w:numPr>
           <w:ilvl w:val="0"/>
-          <w:numId w:val="9"/>
+          <w:numId w:val="11"/>
         </w:numPr>
         <w:tabs>
           <w:tab w:val="clear" w:pos="709"/>
@@ -2595,7 +2971,7 @@
         <w:pStyle w:val="BodyText"/>
         <w:numPr>
           <w:ilvl w:val="0"/>
-          <w:numId w:val="9"/>
+          <w:numId w:val="11"/>
         </w:numPr>
         <w:tabs>
           <w:tab w:val="clear" w:pos="709"/>
@@ -2634,7 +3010,7 @@
         <w:pStyle w:val="BodyText"/>
         <w:numPr>
           <w:ilvl w:val="0"/>
-          <w:numId w:val="9"/>
+          <w:numId w:val="11"/>
         </w:numPr>
         <w:tabs>
           <w:tab w:val="clear" w:pos="709"/>
@@ -3739,6 +4115,262 @@
     </w:lvl>
   </w:abstractNum>
   <w:abstractNum w:abstractNumId="9">
+    <w:lvl w:ilvl="0">
+      <w:start w:val="1"/>
+      <w:numFmt w:val="decimal"/>
+      <w:lvlText w:val="%1."/>
+      <w:lvlJc w:val="start"/>
+      <w:pPr>
+        <w:tabs>
+          <w:tab w:val="num" w:pos="709"/>
+        </w:tabs>
+        <w:ind w:start="709" w:hanging="283"/>
+      </w:pPr>
+      <w:rPr/>
+    </w:lvl>
+    <w:lvl w:ilvl="1">
+      <w:start w:val="1"/>
+      <w:numFmt w:val="decimal"/>
+      <w:lvlText w:val="%2."/>
+      <w:lvlJc w:val="start"/>
+      <w:pPr>
+        <w:tabs>
+          <w:tab w:val="num" w:pos="1418"/>
+        </w:tabs>
+        <w:ind w:start="1418" w:hanging="283"/>
+      </w:pPr>
+      <w:rPr/>
+    </w:lvl>
+    <w:lvl w:ilvl="2">
+      <w:start w:val="1"/>
+      <w:numFmt w:val="decimal"/>
+      <w:lvlText w:val="%3."/>
+      <w:lvlJc w:val="start"/>
+      <w:pPr>
+        <w:tabs>
+          <w:tab w:val="num" w:pos="2127"/>
+        </w:tabs>
+        <w:ind w:start="2127" w:hanging="283"/>
+      </w:pPr>
+      <w:rPr/>
+    </w:lvl>
+    <w:lvl w:ilvl="3">
+      <w:start w:val="1"/>
+      <w:numFmt w:val="decimal"/>
+      <w:lvlText w:val="%4."/>
+      <w:lvlJc w:val="start"/>
+      <w:pPr>
+        <w:tabs>
+          <w:tab w:val="num" w:pos="2836"/>
+        </w:tabs>
+        <w:ind w:start="2836" w:hanging="283"/>
+      </w:pPr>
+      <w:rPr/>
+    </w:lvl>
+    <w:lvl w:ilvl="4">
+      <w:start w:val="1"/>
+      <w:numFmt w:val="decimal"/>
+      <w:lvlText w:val="%5."/>
+      <w:lvlJc w:val="start"/>
+      <w:pPr>
+        <w:tabs>
+          <w:tab w:val="num" w:pos="3545"/>
+        </w:tabs>
+        <w:ind w:start="3545" w:hanging="283"/>
+      </w:pPr>
+      <w:rPr/>
+    </w:lvl>
+    <w:lvl w:ilvl="5">
+      <w:start w:val="1"/>
+      <w:numFmt w:val="decimal"/>
+      <w:lvlText w:val="%6."/>
+      <w:lvlJc w:val="start"/>
+      <w:pPr>
+        <w:tabs>
+          <w:tab w:val="num" w:pos="4254"/>
+        </w:tabs>
+        <w:ind w:start="4254" w:hanging="283"/>
+      </w:pPr>
+      <w:rPr/>
+    </w:lvl>
+    <w:lvl w:ilvl="6">
+      <w:start w:val="1"/>
+      <w:numFmt w:val="decimal"/>
+      <w:lvlText w:val="%7."/>
+      <w:lvlJc w:val="start"/>
+      <w:pPr>
+        <w:tabs>
+          <w:tab w:val="num" w:pos="4963"/>
+        </w:tabs>
+        <w:ind w:start="4963" w:hanging="283"/>
+      </w:pPr>
+      <w:rPr/>
+    </w:lvl>
+    <w:lvl w:ilvl="7">
+      <w:start w:val="1"/>
+      <w:numFmt w:val="decimal"/>
+      <w:lvlText w:val="%8."/>
+      <w:lvlJc w:val="start"/>
+      <w:pPr>
+        <w:tabs>
+          <w:tab w:val="num" w:pos="5672"/>
+        </w:tabs>
+        <w:ind w:start="5672" w:hanging="283"/>
+      </w:pPr>
+      <w:rPr/>
+    </w:lvl>
+    <w:lvl w:ilvl="8">
+      <w:start w:val="1"/>
+      <w:numFmt w:val="decimal"/>
+      <w:lvlText w:val="%9."/>
+      <w:lvlJc w:val="start"/>
+      <w:pPr>
+        <w:tabs>
+          <w:tab w:val="num" w:pos="6381"/>
+        </w:tabs>
+        <w:ind w:start="6381" w:hanging="283"/>
+      </w:pPr>
+      <w:rPr/>
+    </w:lvl>
+  </w:abstractNum>
+  <w:abstractNum w:abstractNumId="10">
+    <w:lvl w:ilvl="0">
+      <w:start w:val="1"/>
+      <w:numFmt w:val="bullet"/>
+      <w:lvlText w:val=""/>
+      <w:lvlJc w:val="start"/>
+      <w:pPr>
+        <w:tabs>
+          <w:tab w:val="num" w:pos="709"/>
+        </w:tabs>
+        <w:ind w:start="709" w:hanging="283"/>
+      </w:pPr>
+      <w:rPr>
+        <w:rFonts w:ascii="Symbol" w:hAnsi="Symbol" w:cs="Symbol" w:hint="default"/>
+      </w:rPr>
+    </w:lvl>
+    <w:lvl w:ilvl="1">
+      <w:start w:val="1"/>
+      <w:numFmt w:val="bullet"/>
+      <w:lvlText w:val=""/>
+      <w:lvlJc w:val="start"/>
+      <w:pPr>
+        <w:tabs>
+          <w:tab w:val="num" w:pos="1418"/>
+        </w:tabs>
+        <w:ind w:start="1418" w:hanging="283"/>
+      </w:pPr>
+      <w:rPr>
+        <w:rFonts w:ascii="Symbol" w:hAnsi="Symbol" w:cs="Symbol" w:hint="default"/>
+      </w:rPr>
+    </w:lvl>
+    <w:lvl w:ilvl="2">
+      <w:start w:val="1"/>
+      <w:numFmt w:val="bullet"/>
+      <w:lvlText w:val=""/>
+      <w:lvlJc w:val="start"/>
+      <w:pPr>
+        <w:tabs>
+          <w:tab w:val="num" w:pos="2127"/>
+        </w:tabs>
+        <w:ind w:start="2127" w:hanging="283"/>
+      </w:pPr>
+      <w:rPr>
+        <w:rFonts w:ascii="Symbol" w:hAnsi="Symbol" w:cs="Symbol" w:hint="default"/>
+      </w:rPr>
+    </w:lvl>
+    <w:lvl w:ilvl="3">
+      <w:start w:val="1"/>
+      <w:numFmt w:val="bullet"/>
+      <w:lvlText w:val=""/>
+      <w:lvlJc w:val="start"/>
+      <w:pPr>
+        <w:tabs>
+          <w:tab w:val="num" w:pos="2836"/>
+        </w:tabs>
+        <w:ind w:start="2836" w:hanging="283"/>
+      </w:pPr>
+      <w:rPr>
+        <w:rFonts w:ascii="Symbol" w:hAnsi="Symbol" w:cs="Symbol" w:hint="default"/>
+      </w:rPr>
+    </w:lvl>
+    <w:lvl w:ilvl="4">
+      <w:start w:val="1"/>
+      <w:numFmt w:val="bullet"/>
+      <w:lvlText w:val=""/>
+      <w:lvlJc w:val="start"/>
+      <w:pPr>
+        <w:tabs>
+          <w:tab w:val="num" w:pos="3545"/>
+        </w:tabs>
+        <w:ind w:start="3545" w:hanging="283"/>
+      </w:pPr>
+      <w:rPr>
+        <w:rFonts w:ascii="Symbol" w:hAnsi="Symbol" w:cs="Symbol" w:hint="default"/>
+      </w:rPr>
+    </w:lvl>
+    <w:lvl w:ilvl="5">
+      <w:start w:val="1"/>
+      <w:numFmt w:val="bullet"/>
+      <w:lvlText w:val=""/>
+      <w:lvlJc w:val="start"/>
+      <w:pPr>
+        <w:tabs>
+          <w:tab w:val="num" w:pos="4254"/>
+        </w:tabs>
+        <w:ind w:start="4254" w:hanging="283"/>
+      </w:pPr>
+      <w:rPr>
+        <w:rFonts w:ascii="Symbol" w:hAnsi="Symbol" w:cs="Symbol" w:hint="default"/>
+      </w:rPr>
+    </w:lvl>
+    <w:lvl w:ilvl="6">
+      <w:start w:val="1"/>
+      <w:numFmt w:val="bullet"/>
+      <w:lvlText w:val=""/>
+      <w:lvlJc w:val="start"/>
+      <w:pPr>
+        <w:tabs>
+          <w:tab w:val="num" w:pos="4963"/>
+        </w:tabs>
+        <w:ind w:start="4963" w:hanging="283"/>
+      </w:pPr>
+      <w:rPr>
+        <w:rFonts w:ascii="Symbol" w:hAnsi="Symbol" w:cs="Symbol" w:hint="default"/>
+      </w:rPr>
+    </w:lvl>
+    <w:lvl w:ilvl="7">
+      <w:start w:val="1"/>
+      <w:numFmt w:val="bullet"/>
+      <w:lvlText w:val=""/>
+      <w:lvlJc w:val="start"/>
+      <w:pPr>
+        <w:tabs>
+          <w:tab w:val="num" w:pos="5672"/>
+        </w:tabs>
+        <w:ind w:start="5672" w:hanging="283"/>
+      </w:pPr>
+      <w:rPr>
+        <w:rFonts w:ascii="Symbol" w:hAnsi="Symbol" w:cs="Symbol" w:hint="default"/>
+      </w:rPr>
+    </w:lvl>
+    <w:lvl w:ilvl="8">
+      <w:start w:val="1"/>
+      <w:numFmt w:val="bullet"/>
+      <w:lvlText w:val=""/>
+      <w:lvlJc w:val="start"/>
+      <w:pPr>
+        <w:tabs>
+          <w:tab w:val="num" w:pos="6381"/>
+        </w:tabs>
+        <w:ind w:start="6381" w:hanging="283"/>
+      </w:pPr>
+      <w:rPr>
+        <w:rFonts w:ascii="Symbol" w:hAnsi="Symbol" w:cs="Symbol" w:hint="default"/>
+      </w:rPr>
+    </w:lvl>
+  </w:abstractNum>
+  <w:abstractNum w:abstractNumId="11">
     <w:lvl w:ilvl="0">
       <w:start w:val="1"/>
       <w:numFmt w:val="bullet"/>
@@ -3901,6 +4533,12 @@
   </w:num>
   <w:num w:numId="9">
     <w:abstractNumId w:val="9"/>
+  </w:num>
+  <w:num w:numId="10">
+    <w:abstractNumId w:val="10"/>
+  </w:num>
+  <w:num w:numId="11">
+    <w:abstractNumId w:val="11"/>
   </w:num>
 </w:numbering>
 </file>
@@ -4014,6 +4652,13 @@
     <w:qFormat/>
     <w:rPr>
       <w:rFonts w:ascii="OpenSymbol" w:hAnsi="OpenSymbol" w:eastAsia="OpenSymbol" w:cs="OpenSymbol"/>
+    </w:rPr>
+  </w:style>
+  <w:style w:type="character" w:styleId="FollowedHyperlink">
+    <w:name w:val="FollowedHyperlink"/>
+    <w:rPr>
+      <w:color w:val="800000"/>
+      <w:u w:val="single"/>
     </w:rPr>
   </w:style>
   <w:style w:type="paragraph" w:styleId="berschrift">

</xml_diff>